<commit_message>
add(entrega 1) se finalizaron los documentos solicitados para esta entrega
</commit_message>
<xml_diff>
--- a/Entrega 1/Fase 1/Evidencias Grupales/Documentos del proyecto/Acta de constitución.docx
+++ b/Entrega 1/Fase 1/Evidencias Grupales/Documentos del proyecto/Acta de constitución.docx
@@ -180,7 +180,7 @@
                         <pic:cNvPicPr preferRelativeResize="0"/>
                       </pic:nvPicPr>
                       <pic:blipFill>
-                        <a:blip r:embed="rId9"/>
+                        <a:blip r:embed="rId7"/>
                         <a:srcRect/>
                         <a:stretch>
                           <a:fillRect/>
@@ -217,7 +217,7 @@
                     <pic:cNvPicPr preferRelativeResize="0"/>
                   </pic:nvPicPr>
                   <pic:blipFill>
-                    <a:blip r:embed="rId10"/>
+                    <a:blip r:embed="rId8"/>
                     <a:srcRect b="0" l="0" r="0" t="0"/>
                     <a:stretch>
                       <a:fillRect/>
@@ -280,7 +280,7 @@
     </w:p>
     <w:sdt>
       <w:sdtPr>
-        <w:id w:val="1242813806"/>
+        <w:id w:val="313109826"/>
         <w:docPartObj>
           <w:docPartGallery w:val="Table of Contents"/>
           <w:docPartUnique w:val="1"/>
@@ -3756,7 +3756,7 @@
           <w:sdt>
             <w:sdtPr>
               <w:lock w:val="contentLocked"/>
-              <w:id w:val="-2000635591"/>
+              <w:id w:val="627591723"/>
               <w:tag w:val="goog_rdk_0"/>
             </w:sdtPr>
             <w:sdtContent>
@@ -4556,7 +4556,7 @@
           <w:sdt>
             <w:sdtPr>
               <w:lock w:val="contentLocked"/>
-              <w:id w:val="1798182298"/>
+              <w:id w:val="1427331924"/>
               <w:tag w:val="goog_rdk_1"/>
             </w:sdtPr>
             <w:sdtContent>
@@ -7442,15 +7442,6 @@
               </w:rPr>
               <w:t xml:space="preserve">L</w:t>
             </w:r>
-            <w:sdt>
-              <w:sdtPr>
-                <w:id w:val="230193404"/>
-                <w:tag w:val="goog_rdk_2"/>
-              </w:sdtPr>
-              <w:sdtContent>
-                <w:commentRangeStart w:id="0"/>
-              </w:sdtContent>
-            </w:sdt>
             <w:r>
               <w:rPr>
                 <w:rtl w:val="0"/>
@@ -7474,10 +7465,6 @@
               <w:spacing w:after="0" w:before="0" w:lineRule="auto"/>
               <w:rPr/>
             </w:pPr>
-            <w:commentRangeEnd w:id="0"/>
-            <w:r>
-              <w:commentReference w:id="0"/>
-            </w:r>
             <w:r>
               <w:rPr>
                 <w:rtl w:val="0"/>
@@ -9513,7 +9500,7 @@
                     <pic:cNvPicPr preferRelativeResize="0"/>
                   </pic:nvPicPr>
                   <pic:blipFill>
-                    <a:blip r:embed="rId11"/>
+                    <a:blip r:embed="rId9"/>
                     <a:srcRect b="0" l="0" r="0" t="0"/>
                     <a:stretch>
                       <a:fillRect/>
@@ -10366,7 +10353,7 @@
       </w:r>
     </w:p>
     <w:sectPr>
-      <w:headerReference r:id="rId12" w:type="default"/>
+      <w:headerReference r:id="rId10" w:type="default"/>
       <w:pgSz w:h="15840" w:w="12240" w:orient="portrait"/>
       <w:pgMar w:bottom="1440" w:top="1734" w:left="1080" w:right="1080" w:header="708" w:footer="708"/>
       <w:pgNumType w:start="0"/>
@@ -10374,72 +10361,6 @@
     </w:sectPr>
   </w:body>
 </w:document>
-</file>
-
-<file path=word/comments.xml><?xml version="1.0" encoding="utf-8"?>
-<w:comments xmlns:mc="http://schemas.openxmlformats.org/markup-compatibility/2006" xmlns:o="urn:schemas-microsoft-com:office:office" xmlns:r="http://schemas.openxmlformats.org/officeDocument/2006/relationships" xmlns:m="http://schemas.openxmlformats.org/officeDocument/2006/math" xmlns:v="urn:schemas-microsoft-com:vml" xmlns:wp="http://schemas.openxmlformats.org/drawingml/2006/wordprocessingDrawing" xmlns:w10="urn:schemas-microsoft-com:office:word" xmlns:w="http://schemas.openxmlformats.org/wordprocessingml/2006/main" xmlns:wne="http://schemas.microsoft.com/office/word/2006/wordml" xmlns:sl="http://schemas.openxmlformats.org/schemaLibrary/2006/main" xmlns:a="http://schemas.openxmlformats.org/drawingml/2006/main" xmlns:pic="http://schemas.openxmlformats.org/drawingml/2006/picture" xmlns:c="http://schemas.openxmlformats.org/drawingml/2006/chart" xmlns:lc="http://schemas.openxmlformats.org/drawingml/2006/lockedCanvas" xmlns:dgm="http://schemas.openxmlformats.org/drawingml/2006/diagram" xmlns:wps="http://schemas.microsoft.com/office/word/2010/wordprocessingShape" xmlns:wpg="http://schemas.microsoft.com/office/word/2010/wordprocessingGroup" xmlns:w14="http://schemas.microsoft.com/office/word/2010/wordml" xmlns:w15="http://schemas.microsoft.com/office/word/2012/wordml" xmlns:w16="http://schemas.microsoft.com/office/word/2018/wordml" xmlns:w16cex="http://schemas.microsoft.com/office/word/2018/wordml/cex" xmlns:w16cid="http://schemas.microsoft.com/office/word/2016/wordml/cid" xmlns="http://schemas.microsoft.com/office/tasks/2019/documenttasks" xmlns:cr="http://schemas.microsoft.com/office/comments/2020/reactions">
-  <w:comment w:author="JOAQUIN . PEREZ URZUA" w:id="0" w:date="2026-08-26T23:30:03Z">
-    <w:p>
-      <w:pPr>
-        <w:keepNext w:val="0"/>
-        <w:keepLines w:val="0"/>
-        <w:pageBreakBefore w:val="0"/>
-        <w:widowControl w:val="0"/>
-        <w:pBdr>
-          <w:top w:space="0" w:sz="0" w:val="nil"/>
-          <w:left w:space="0" w:sz="0" w:val="nil"/>
-          <w:bottom w:space="0" w:sz="0" w:val="nil"/>
-          <w:right w:space="0" w:sz="0" w:val="nil"/>
-          <w:between w:space="0" w:sz="0" w:val="nil"/>
-        </w:pBdr>
-        <w:shd w:fill="auto" w:val="clear"/>
-        <w:spacing w:after="0" w:before="0" w:line="240" w:lineRule="auto"/>
-        <w:ind w:left="0" w:right="0" w:firstLine="0"/>
-        <w:jc w:val="left"/>
-        <w:rPr>
-          <w:rFonts w:ascii="Arial" w:cs="Arial" w:eastAsia="Arial" w:hAnsi="Arial"/>
-          <w:b w:val="0"/>
-          <w:bCs w:val="0"/>
-          <w:i w:val="0"/>
-          <w:iCs w:val="0"/>
-          <w:smallCaps w:val="0"/>
-          <w:strike w:val="0"/>
-          <w:color w:val="000000"/>
-          <w:sz w:val="22"/>
-          <w:szCs w:val="22"/>
-          <w:u w:val="none"/>
-          <w:shd w:fill="auto" w:val="clear"/>
-          <w:vertAlign w:val="baseline"/>
-        </w:rPr>
-      </w:pPr>
-      <w:r>
-        <w:rPr>
-          <w:rFonts w:ascii="Arial" w:cs="Arial" w:eastAsia="Arial" w:hAnsi="Arial"/>
-          <w:b w:val="0"/>
-          <w:bCs w:val="0"/>
-          <w:i w:val="0"/>
-          <w:iCs w:val="0"/>
-          <w:smallCaps w:val="0"/>
-          <w:strike w:val="0"/>
-          <w:color w:val="000000"/>
-          <w:sz w:val="22"/>
-          <w:szCs w:val="22"/>
-          <w:u w:val="none"/>
-          <w:shd w:fill="auto" w:val="clear"/>
-          <w:vertAlign w:val="baseline"/>
-          <w:rtl w:val="0"/>
-        </w:rPr>
-        <w:t xml:space="preserve">las cuentas de admin y marcas pueden interferir en esto??</w:t>
-      </w:r>
-    </w:p>
-  </w:comment>
-</w:comments>
-</file>
-
-<file path=word/commentsExtended.xml><?xml version="1.0" encoding="utf-8"?>
-<w15:commentsEx xmlns:mc="http://schemas.openxmlformats.org/markup-compatibility/2006" xmlns:o="urn:schemas-microsoft-com:office:office" xmlns:r="http://schemas.openxmlformats.org/officeDocument/2006/relationships" xmlns:m="http://schemas.openxmlformats.org/officeDocument/2006/math" xmlns:v="urn:schemas-microsoft-com:vml" xmlns:wp="http://schemas.openxmlformats.org/drawingml/2006/wordprocessingDrawing" xmlns:w10="urn:schemas-microsoft-com:office:word" xmlns:w="http://schemas.openxmlformats.org/wordprocessingml/2006/main" xmlns:wne="http://schemas.microsoft.com/office/word/2006/wordml" xmlns:sl="http://schemas.openxmlformats.org/schemaLibrary/2006/main" xmlns:a="http://schemas.openxmlformats.org/drawingml/2006/main" xmlns:pic="http://schemas.openxmlformats.org/drawingml/2006/picture" xmlns:c="http://schemas.openxmlformats.org/drawingml/2006/chart" xmlns:lc="http://schemas.openxmlformats.org/drawingml/2006/lockedCanvas" xmlns:dgm="http://schemas.openxmlformats.org/drawingml/2006/diagram" xmlns:wps="http://schemas.microsoft.com/office/word/2010/wordprocessingShape" xmlns:wpg="http://schemas.microsoft.com/office/word/2010/wordprocessingGroup" xmlns:w14="http://schemas.microsoft.com/office/word/2010/wordml" xmlns:w15="http://schemas.microsoft.com/office/word/2012/wordml" xmlns:w16="http://schemas.microsoft.com/office/word/2018/wordml" xmlns:w16cex="http://schemas.microsoft.com/office/word/2018/wordml/cex" xmlns:w16cid="http://schemas.microsoft.com/office/word/2016/wordml/cid" xmlns="http://schemas.microsoft.com/office/tasks/2019/documenttasks" xmlns:cr="http://schemas.microsoft.com/office/comments/2020/reactions">
-  <w15:commentEx w15:paraId="000001BF" w15:done="0"/>
-</w15:commentsEx>
 </file>
 
 <file path=word/header1.xml><?xml version="1.0" encoding="utf-8"?>
@@ -12163,7 +12084,7 @@
 
 <file path=customXML/item1.xml><?xml version="1.0" encoding="utf-8"?>
 <go:gDocsCustomXmlDataStorage xmlns:go="http://customooxmlschemas.google.com/" xmlns:r="http://schemas.openxmlformats.org/officeDocument/2006/relationships" uri="GoogleDocsCustomDataVersion2">
-  <go:docsCustomData xmlns:go="http://customooxmlschemas.google.com/" roundtripDataSignature="AMtx7miytjN11kHk+mLHKF44iXm+LxPisw==">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</go:docsCustomData>
+  <go:docsCustomData xmlns:go="http://customooxmlschemas.google.com/" roundtripDataSignature="AMtx7mij2lQtDJO7qUIY3yR87p+5qrAYDQ==">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</go:docsCustomData>
 </go:gDocsCustomXmlDataStorage>
 </file>
 

</xml_diff>